<commit_message>
Android Profil Page in progress
</commit_message>
<xml_diff>
--- a/8_term/Основы программирования и конфигурирования 1С/Губин_ЕВ_ИУК_4_82_Б_2026_Основы_программирования_и_конфигурирования_1С.docx
+++ b/8_term/Основы программирования и конфигурирования 1С/Губин_ЕВ_ИУК_4_82_Б_2026_Основы_программирования_и_конфигурирования_1С.docx
@@ -371,31 +371,7 @@
           <w:sz w:val="36"/>
           <w:szCs w:val="36"/>
         </w:rPr>
-        <w:t>ПРАКТИЧЕСКАЯ</w:t>
-      </w:r>
-      <w:r>
-        <w:rPr>
-          <w:b/>
-          <w:sz w:val="36"/>
-          <w:szCs w:val="36"/>
-        </w:rPr>
-        <w:t xml:space="preserve"> </w:t>
-      </w:r>
-      <w:r>
-        <w:rPr>
-          <w:b/>
-          <w:sz w:val="36"/>
-          <w:szCs w:val="36"/>
-        </w:rPr>
-        <w:t>РАБОТА</w:t>
-      </w:r>
-      <w:r>
-        <w:rPr>
-          <w:b/>
-          <w:sz w:val="36"/>
-          <w:szCs w:val="36"/>
-        </w:rPr>
-        <w:t xml:space="preserve"> №1</w:t>
+        <w:t>ЛАБОРАТОРНЫЕ РАБОТЫ</w:t>
       </w:r>
     </w:p>
     <w:p/>
@@ -413,7 +389,23 @@
           <w:sz w:val="32"/>
           <w:szCs w:val="32"/>
         </w:rPr>
-        <w:t>«»</w:t>
+        <w:t>«</w:t>
+      </w:r>
+      <w:r>
+        <w:rPr>
+          <w:b/>
+          <w:sz w:val="32"/>
+          <w:szCs w:val="32"/>
+        </w:rPr>
+        <w:t>Введение в конфигурирование в системе 1С: Предприятие 8.3</w:t>
+      </w:r>
+      <w:r>
+        <w:rPr>
+          <w:b/>
+          <w:sz w:val="32"/>
+          <w:szCs w:val="32"/>
+        </w:rPr>
+        <w:t>»</w:t>
       </w:r>
     </w:p>
     <w:p/>

</xml_diff>